<commit_message>
maj formats styles template
</commit_message>
<xml_diff>
--- a/templates_docx/template_jinja.docx
+++ b/templates_docx/template_jinja.docx
@@ -25,8 +25,6 @@
       <w:r>
         <w:rPr>
           <w:noProof/>
-          <w:sz w:val="40"/>
-          <w:szCs w:val="40"/>
         </w:rPr>
         <w:drawing>
           <wp:inline distT="0" distB="0" distL="0" distR="0" wp14:anchorId="4A26F4D6" wp14:editId="0940272F">
@@ -1305,92 +1303,80 @@
     </w:tbl>
     <w:p>
       <w:pPr>
-        <w:pStyle w:val="DCNormal"/>
-      </w:pPr>
-      <w:r>
-        <w:t xml:space="preserve">{% </w:t>
-      </w:r>
-      <w:proofErr w:type="spellStart"/>
-      <w:r>
-        <w:t>endif</w:t>
-      </w:r>
-      <w:proofErr w:type="spellEnd"/>
-      <w:r>
-        <w:t xml:space="preserve"> %}</w:t>
-      </w:r>
-    </w:p>
-    <w:p>
-      <w:pPr>
-        <w:pStyle w:val="DCNormal"/>
-      </w:pPr>
-      <w:r>
-        <w:t xml:space="preserve">{% </w:t>
-      </w:r>
-      <w:proofErr w:type="spellStart"/>
-      <w:r>
-        <w:t>endif</w:t>
-      </w:r>
-      <w:proofErr w:type="spellEnd"/>
-      <w:r>
-        <w:t xml:space="preserve"> </w:t>
-      </w:r>
-      <w:proofErr w:type="gramStart"/>
-      <w:r>
-        <w:t>%}</w:t>
-      </w:r>
-      <w:r>
-        <w:t>{</w:t>
-      </w:r>
-      <w:proofErr w:type="gramEnd"/>
-      <w:r>
-        <w:t>%</w:t>
-      </w:r>
-      <w:r>
-        <w:t xml:space="preserve"> if fo</w:t>
-      </w:r>
-      <w:r>
-        <w:t>r</w:t>
-      </w:r>
-      <w:r>
-        <w:t>mations %}</w:t>
-      </w:r>
-    </w:p>
-    <w:p>
-      <w:pPr>
-        <w:spacing w:after="200"/>
-        <w:rPr>
-          <w:sz w:val="20"/>
-        </w:rPr>
-      </w:pPr>
-      <w:r>
-        <w:br w:type="page"/>
-      </w:r>
-    </w:p>
-    <w:p>
-      <w:pPr>
         <w:pStyle w:val="DCT1Sections"/>
         <w:rPr>
           <w:lang w:val="fr-FR"/>
         </w:rPr>
       </w:pPr>
       <w:r>
+        <w:t xml:space="preserve">{% endif </w:t>
+      </w:r>
+      <w:proofErr w:type="gramStart"/>
+      <w:r>
+        <w:t>%}</w:t>
+      </w:r>
+      <w:r>
+        <w:t>{</w:t>
+      </w:r>
+      <w:proofErr w:type="gramEnd"/>
+      <w:r>
+        <w:t xml:space="preserve">% endif </w:t>
+      </w:r>
+      <w:proofErr w:type="gramStart"/>
+      <w:r>
+        <w:t>%}</w:t>
+      </w:r>
+      <w:r>
+        <w:t>{</w:t>
+      </w:r>
+      <w:proofErr w:type="gramEnd"/>
+      <w:r>
+        <w:t>%</w:t>
+      </w:r>
+      <w:r>
+        <w:t xml:space="preserve"> if fo</w:t>
+      </w:r>
+      <w:r>
+        <w:t>r</w:t>
+      </w:r>
+      <w:r>
+        <w:t xml:space="preserve">mations </w:t>
+      </w:r>
+      <w:proofErr w:type="gramStart"/>
+      <w:r>
+        <w:t>%}</w:t>
+      </w:r>
+      <w:r>
         <w:rPr>
           <w:lang w:val="fr-FR"/>
         </w:rPr>
-        <w:lastRenderedPageBreak/>
-        <w:t xml:space="preserve">Formations, </w:t>
-      </w:r>
+        <w:t>Formations</w:t>
+      </w:r>
+      <w:proofErr w:type="gramEnd"/>
       <w:r>
         <w:rPr>
           <w:lang w:val="fr-FR"/>
         </w:rPr>
-        <w:t>Diplômes</w:t>
-      </w:r>
-    </w:p>
-    <w:p>
-      <w:pPr>
-        <w:pStyle w:val="DCNormal"/>
-      </w:pPr>
+        <w:t xml:space="preserve">, </w:t>
+      </w:r>
+      <w:r>
+        <w:rPr>
+          <w:lang w:val="fr-FR"/>
+        </w:rPr>
+        <w:t>Dipl</w:t>
+      </w:r>
+      <w:r>
+        <w:rPr>
+          <w:lang w:val="fr-FR"/>
+        </w:rPr>
+        <w:t>ô</w:t>
+      </w:r>
+      <w:r>
+        <w:rPr>
+          <w:lang w:val="fr-FR"/>
+        </w:rPr>
+        <w:t>mes</w:t>
+      </w:r>
     </w:p>
     <w:tbl>
       <w:tblPr>
@@ -1461,14 +1447,12 @@
             <w:r>
               <w:rPr>
                 <w:b/>
-                <w:bCs w:val="0"/>
               </w:rPr>
               <w:t>{</w:t>
             </w:r>
             <w:r>
               <w:rPr>
                 <w:b/>
-                <w:bCs w:val="0"/>
               </w:rPr>
               <w:t>{</w:t>
             </w:r>
@@ -1477,14 +1461,12 @@
             <w:r>
               <w:rPr>
                 <w:b/>
-                <w:bCs w:val="0"/>
               </w:rPr>
               <w:t>entry.</w:t>
             </w:r>
             <w:r>
               <w:rPr>
                 <w:b/>
-                <w:bCs w:val="0"/>
               </w:rPr>
               <w:t>title</w:t>
             </w:r>
@@ -1493,14 +1475,12 @@
             <w:r>
               <w:rPr>
                 <w:b/>
-                <w:bCs w:val="0"/>
               </w:rPr>
               <w:t>}</w:t>
             </w:r>
             <w:r>
               <w:rPr>
                 <w:b/>
-                <w:bCs w:val="0"/>
               </w:rPr>
               <w:t>}</w:t>
             </w:r>
@@ -1609,58 +1589,45 @@
     </w:tbl>
     <w:p>
       <w:pPr>
-        <w:pStyle w:val="DCNormal"/>
-      </w:pPr>
-      <w:r>
-        <w:t xml:space="preserve">{% </w:t>
-      </w:r>
-      <w:proofErr w:type="spellStart"/>
-      <w:r>
-        <w:t>endif</w:t>
-      </w:r>
-      <w:proofErr w:type="spellEnd"/>
-      <w:r>
-        <w:t xml:space="preserve"> </w:t>
-      </w:r>
-      <w:proofErr w:type="gramStart"/>
-      <w:r>
-        <w:t>%}</w:t>
-      </w:r>
-      <w:r>
-        <w:t>{</w:t>
-      </w:r>
-      <w:proofErr w:type="gramEnd"/>
-      <w:r>
-        <w:t>%</w:t>
-      </w:r>
-      <w:r>
-        <w:t xml:space="preserve"> if </w:t>
-      </w:r>
-      <w:r>
-        <w:t>certifications</w:t>
-      </w:r>
-      <w:r>
-        <w:t xml:space="preserve"> %}</w:t>
-      </w:r>
-    </w:p>
-    <w:p>
-      <w:pPr>
         <w:pStyle w:val="DCT1Sections"/>
         <w:rPr>
           <w:lang w:val="fr-FR"/>
         </w:rPr>
       </w:pPr>
       <w:r>
+        <w:t xml:space="preserve">{% endif </w:t>
+      </w:r>
+      <w:proofErr w:type="gramStart"/>
+      <w:r>
+        <w:t>%}</w:t>
+      </w:r>
+      <w:r>
+        <w:t>{</w:t>
+      </w:r>
+      <w:proofErr w:type="gramEnd"/>
+      <w:r>
+        <w:t>%</w:t>
+      </w:r>
+      <w:r>
+        <w:t xml:space="preserve"> if </w:t>
+      </w:r>
+      <w:r>
+        <w:t>certifications</w:t>
+      </w:r>
+      <w:r>
+        <w:t xml:space="preserve"> </w:t>
+      </w:r>
+      <w:proofErr w:type="gramStart"/>
+      <w:r>
+        <w:t>%}</w:t>
+      </w:r>
+      <w:r>
         <w:rPr>
           <w:lang w:val="fr-FR"/>
         </w:rPr>
         <w:t>Certifications</w:t>
       </w:r>
-    </w:p>
-    <w:p>
-      <w:pPr>
-        <w:pStyle w:val="DCNormal"/>
-      </w:pPr>
+      <w:proofErr w:type="gramEnd"/>
     </w:p>
     <w:tbl>
       <w:tblPr>
@@ -1726,7 +1693,6 @@
             <w:r>
               <w:rPr>
                 <w:b/>
-                <w:bCs w:val="0"/>
               </w:rPr>
               <w:t>{{</w:t>
             </w:r>
@@ -1735,7 +1701,6 @@
             <w:r>
               <w:rPr>
                 <w:b/>
-                <w:bCs w:val="0"/>
               </w:rPr>
               <w:t>entry.title</w:t>
             </w:r>
@@ -1743,7 +1708,6 @@
             <w:r>
               <w:rPr>
                 <w:b/>
-                <w:bCs w:val="0"/>
               </w:rPr>
               <w:t>}}</w:t>
             </w:r>
@@ -1837,52 +1801,47 @@
     </w:tbl>
     <w:p>
       <w:pPr>
-        <w:pStyle w:val="DCNormal"/>
-      </w:pPr>
-      <w:r>
-        <w:t xml:space="preserve">{% </w:t>
-      </w:r>
-      <w:proofErr w:type="spellStart"/>
-      <w:r>
-        <w:t>endif</w:t>
-      </w:r>
-      <w:proofErr w:type="spellEnd"/>
-      <w:r>
-        <w:t xml:space="preserve"> </w:t>
-      </w:r>
-      <w:proofErr w:type="gramStart"/>
-      <w:r>
-        <w:t>%}</w:t>
-      </w:r>
-      <w:r>
-        <w:t>{</w:t>
-      </w:r>
-      <w:proofErr w:type="gramEnd"/>
-      <w:r>
-        <w:t>%</w:t>
-      </w:r>
-      <w:r>
-        <w:t xml:space="preserve"> if langues %}</w:t>
-      </w:r>
-    </w:p>
-    <w:p>
-      <w:pPr>
         <w:pStyle w:val="DCT1Sections"/>
         <w:rPr>
           <w:lang w:val="fr-FR"/>
         </w:rPr>
       </w:pPr>
       <w:r>
+        <w:t xml:space="preserve">{% endif </w:t>
+      </w:r>
+      <w:proofErr w:type="gramStart"/>
+      <w:r>
+        <w:t>%}</w:t>
+      </w:r>
+      <w:r>
+        <w:t>{</w:t>
+      </w:r>
+      <w:proofErr w:type="gramEnd"/>
+      <w:r>
+        <w:t>%</w:t>
+      </w:r>
+      <w:r>
+        <w:t xml:space="preserve"> if </w:t>
+      </w:r>
+      <w:proofErr w:type="spellStart"/>
+      <w:r>
+        <w:t>langues</w:t>
+      </w:r>
+      <w:proofErr w:type="spellEnd"/>
+      <w:r>
+        <w:t xml:space="preserve"> </w:t>
+      </w:r>
+      <w:proofErr w:type="gramStart"/>
+      <w:r>
+        <w:t>%}</w:t>
+      </w:r>
+      <w:r>
         <w:rPr>
           <w:lang w:val="fr-FR"/>
         </w:rPr>
         <w:t>Langues</w:t>
       </w:r>
-    </w:p>
-    <w:p>
-      <w:pPr>
-        <w:pStyle w:val="DCNormal"/>
-      </w:pPr>
+      <w:proofErr w:type="gramEnd"/>
     </w:p>
     <w:tbl>
       <w:tblPr>
@@ -2063,17 +2022,6 @@
     </w:p>
     <w:p>
       <w:pPr>
-        <w:spacing w:after="200"/>
-        <w:rPr>
-          <w:sz w:val="20"/>
-        </w:rPr>
-      </w:pPr>
-      <w:r>
-        <w:br w:type="page"/>
-      </w:r>
-    </w:p>
-    <w:p>
-      <w:pPr>
         <w:pStyle w:val="DCT1Sections"/>
         <w:rPr>
           <w:lang w:val="fr-FR"/>
@@ -2083,7 +2031,6 @@
         <w:rPr>
           <w:lang w:val="fr-FR"/>
         </w:rPr>
-        <w:lastRenderedPageBreak/>
         <w:t>Exp</w:t>
       </w:r>
       <w:r>
@@ -2248,50 +2195,36 @@
       <w:proofErr w:type="spellEnd"/>
       <w:proofErr w:type="gramEnd"/>
       <w:r>
-        <w:t xml:space="preserve"> %}</w:t>
-      </w:r>
-    </w:p>
-    <w:p>
-      <w:pPr>
-        <w:pStyle w:val="DCNormal"/>
-      </w:pPr>
+        <w:t xml:space="preserve"> </w:t>
+      </w:r>
+      <w:proofErr w:type="gramStart"/>
+      <w:r>
+        <w:t>%}</w:t>
+      </w:r>
       <w:r>
         <w:rPr>
           <w:b/>
+          <w:bCs/>
         </w:rPr>
         <w:t>Contexte</w:t>
       </w:r>
-      <w:r>
-        <w:rPr>
-          <w:b/>
-        </w:rPr>
+      <w:proofErr w:type="gramEnd"/>
+      <w:r>
         <w:t> :</w:t>
       </w:r>
       <w:r>
-        <w:rPr>
-          <w:b/>
-        </w:rPr>
         <w:t xml:space="preserve"> {{</w:t>
       </w:r>
       <w:proofErr w:type="spellStart"/>
       <w:proofErr w:type="gramStart"/>
       <w:r>
-        <w:rPr>
-          <w:b/>
-        </w:rPr>
         <w:t>item</w:t>
       </w:r>
       <w:r>
-        <w:rPr>
-          <w:b/>
-        </w:rPr>
         <w:t>.context</w:t>
       </w:r>
       <w:proofErr w:type="spellEnd"/>
       <w:r>
-        <w:rPr>
-          <w:b/>
-        </w:rPr>
         <w:t>}}</w:t>
       </w:r>
       <w:r>
@@ -15079,10 +15012,11 @@
     <w:name w:val="DC_T1_Sections"/>
     <w:next w:val="DCNormal"/>
     <w:link w:val="DCT1SectionsCar"/>
+    <w:autoRedefine/>
     <w:qFormat/>
-    <w:rsid w:val="00CC25EA"/>
+    <w:rsid w:val="00B12582"/>
     <w:pPr>
-      <w:spacing w:before="120" w:after="120" w:line="240" w:lineRule="auto"/>
+      <w:spacing w:after="0" w:line="240" w:lineRule="auto"/>
       <w:ind w:left="567"/>
       <w:outlineLvl w:val="0"/>
     </w:pPr>
@@ -15099,10 +15033,10 @@
   <w:style w:type="paragraph" w:customStyle="1" w:styleId="DC1stbullet">
     <w:name w:val="DC_1st_bullet"/>
     <w:basedOn w:val="DCT1Sections"/>
+    <w:autoRedefine/>
     <w:qFormat/>
-    <w:rsid w:val="00F42C8E"/>
+    <w:rsid w:val="00F0079A"/>
     <w:pPr>
-      <w:spacing w:before="0"/>
       <w:ind w:left="0"/>
       <w:outlineLvl w:val="2"/>
     </w:pPr>
@@ -15117,8 +15051,9 @@
   <w:style w:type="paragraph" w:customStyle="1" w:styleId="DCTableBlueTitle">
     <w:name w:val="DC_Table_BlueTitle"/>
     <w:basedOn w:val="DCTableContent"/>
+    <w:autoRedefine/>
     <w:qFormat/>
-    <w:rsid w:val="00ED10F4"/>
+    <w:rsid w:val="00B12582"/>
     <w:pPr>
       <w:jc w:val="right"/>
     </w:pPr>
@@ -15141,8 +15076,9 @@
   <w:style w:type="paragraph" w:customStyle="1" w:styleId="DCTableYear">
     <w:name w:val="DC_Table_Year"/>
     <w:basedOn w:val="DCTableContent"/>
+    <w:autoRedefine/>
     <w:qFormat/>
-    <w:rsid w:val="009E21FF"/>
+    <w:rsid w:val="00502F8C"/>
     <w:rPr>
       <w:b/>
     </w:rPr>
@@ -15215,7 +15151,7 @@
     <w:name w:val="DC_T1_Sections Car"/>
     <w:basedOn w:val="Policepardfaut"/>
     <w:link w:val="DCT1Sections"/>
-    <w:rsid w:val="00CC25EA"/>
+    <w:rsid w:val="00B12582"/>
     <w:rPr>
       <w:rFonts w:ascii="Arial" w:eastAsiaTheme="majorEastAsia" w:hAnsi="Arial" w:cstheme="majorBidi"/>
       <w:b/>
@@ -15229,10 +15165,11 @@
   <w:style w:type="paragraph" w:customStyle="1" w:styleId="DCNormal">
     <w:name w:val="DC_Normal"/>
     <w:basedOn w:val="Normal"/>
+    <w:autoRedefine/>
     <w:qFormat/>
-    <w:rsid w:val="003859C7"/>
+    <w:rsid w:val="00395ECC"/>
     <w:pPr>
-      <w:spacing w:after="120" w:line="240" w:lineRule="auto"/>
+      <w:spacing w:after="0" w:line="240" w:lineRule="auto"/>
       <w:jc w:val="both"/>
     </w:pPr>
     <w:rPr>
@@ -15242,8 +15179,9 @@
   <w:style w:type="paragraph" w:customStyle="1" w:styleId="DC2ndbullet">
     <w:name w:val="DC_2nd_bullet"/>
     <w:basedOn w:val="DC1stbullet"/>
+    <w:autoRedefine/>
     <w:qFormat/>
-    <w:rsid w:val="001321A2"/>
+    <w:rsid w:val="00F0079A"/>
     <w:pPr>
       <w:numPr>
         <w:numId w:val="13"/>
@@ -15255,7 +15193,7 @@
         <w:right w:val="nil"/>
         <w:between w:val="nil"/>
       </w:pBdr>
-      <w:ind w:left="993" w:hanging="426"/>
+      <w:ind w:left="992" w:hanging="425"/>
       <w:contextualSpacing/>
       <w:jc w:val="both"/>
       <w:outlineLvl w:val="9"/>
@@ -15298,8 +15236,9 @@
   <w:style w:type="paragraph" w:customStyle="1" w:styleId="DCTableContent">
     <w:name w:val="DC_Table_Content"/>
     <w:basedOn w:val="DCNormal"/>
+    <w:autoRedefine/>
     <w:qFormat/>
-    <w:rsid w:val="009E21FF"/>
+    <w:rsid w:val="00502F8C"/>
     <w:pPr>
       <w:pBdr>
         <w:top w:val="nil"/>
@@ -15308,7 +15247,6 @@
         <w:right w:val="nil"/>
         <w:between w:val="nil"/>
       </w:pBdr>
-      <w:spacing w:before="120"/>
       <w:ind w:left="57" w:right="57"/>
       <w:jc w:val="left"/>
     </w:pPr>
@@ -15322,9 +15260,8 @@
     <w:name w:val="DC_XP_Title"/>
     <w:basedOn w:val="DCNormal"/>
     <w:qFormat/>
-    <w:rsid w:val="00E7484B"/>
+    <w:rsid w:val="00502F8C"/>
     <w:pPr>
-      <w:spacing w:before="120"/>
       <w:ind w:left="57" w:right="57"/>
       <w:outlineLvl w:val="1"/>
     </w:pPr>
@@ -15337,10 +15274,10 @@
   <w:style w:type="paragraph" w:customStyle="1" w:styleId="DCXPDate">
     <w:name w:val="DC_XP_Date"/>
     <w:basedOn w:val="DCNormal"/>
+    <w:autoRedefine/>
     <w:qFormat/>
-    <w:rsid w:val="009E21FF"/>
+    <w:rsid w:val="00502F8C"/>
     <w:pPr>
-      <w:spacing w:before="120"/>
       <w:ind w:left="57" w:right="57"/>
       <w:jc w:val="right"/>
     </w:pPr>
@@ -15357,10 +15294,10 @@
   <w:style w:type="paragraph" w:customStyle="1" w:styleId="DCXPPoste">
     <w:name w:val="DC_XP_Poste"/>
     <w:basedOn w:val="DCNormal"/>
+    <w:autoRedefine/>
     <w:qFormat/>
-    <w:rsid w:val="009E21FF"/>
+    <w:rsid w:val="00502F8C"/>
     <w:pPr>
-      <w:spacing w:before="120"/>
       <w:ind w:left="57" w:right="57"/>
     </w:pPr>
     <w:rPr>
@@ -15375,10 +15312,11 @@
   <w:style w:type="paragraph" w:customStyle="1" w:styleId="DCXPBlueContent">
     <w:name w:val="DC_XP_BlueContent"/>
     <w:basedOn w:val="Normal"/>
+    <w:autoRedefine/>
     <w:qFormat/>
-    <w:rsid w:val="00035265"/>
+    <w:rsid w:val="00502F8C"/>
     <w:pPr>
-      <w:spacing w:after="120" w:line="240" w:lineRule="auto"/>
+      <w:spacing w:after="0" w:line="240" w:lineRule="auto"/>
       <w:jc w:val="both"/>
     </w:pPr>
     <w:rPr>
@@ -15390,6 +15328,7 @@
   <w:style w:type="paragraph" w:customStyle="1" w:styleId="DCTableSkillsTitle">
     <w:name w:val="DC_Table_Skills_Title"/>
     <w:basedOn w:val="DCTableContent"/>
+    <w:autoRedefine/>
     <w:qFormat/>
     <w:rsid w:val="006972D9"/>
     <w:pPr>
@@ -15404,8 +15343,9 @@
   <w:style w:type="paragraph" w:customStyle="1" w:styleId="DCTableSkillsContent">
     <w:name w:val="DC_Table_Skills_Content"/>
     <w:basedOn w:val="DCTableContent"/>
+    <w:autoRedefine/>
     <w:qFormat/>
-    <w:rsid w:val="006972D9"/>
+    <w:rsid w:val="00502F8C"/>
     <w:rPr>
       <w:color w:val="F69545"/>
     </w:rPr>

</xml_diff>